<commit_message>
Keep the drag preview compact and neutralise the sample Word fixture
</commit_message>
<xml_diff>
--- a/frontend/e2e/fixtures/sample.docx
+++ b/frontend/e2e/fixtures/sample.docx
@@ -3,25 +3,22 @@
 <w:document xmlns:w="http://schemas.openxmlformats.org/wordprocessingml/2006/main">
   <w:body>
     <w:p>
-      <w:pPr>
-        <w:pStyle w:val="Heading1"/>
-      </w:pPr>
       <w:r>
         <w:rPr>
           <w:b/>
           <w:sz w:val="36"/>
         </w:rPr>
-        <w:t>Vanguard statement (sample)</w:t>
+        <w:t>Sample statement</w:t>
       </w:r>
     </w:p>
     <w:p>
       <w:r>
-        <w:t>Statement date: 5 October 2026. This is a placeholder Word document used to check the in-app preview.</w:t>
+        <w:t>This is a placeholder Word document used to demonstrate the in-app preview. It contains no real account information.</w:t>
       </w:r>
     </w:p>
     <w:p>
       <w:r>
-        <w:t>Account summary: no real account information.</w:t>
+        <w:t>Statement period: example only.</w:t>
       </w:r>
     </w:p>
     <w:sectPr>

</xml_diff>